<commit_message>
Sonar reconstruction scored against CAD; closure checks vs drift; methods, results, limitations, abstract
</commit_message>
<xml_diff>
--- a/docs/paper/DeepSight_Introduction_LitSurvey_v2.docx
+++ b/docs/paper/DeepSight_Introduction_LitSurvey_v2.docx
@@ -95,7 +95,7 @@
         <w:rPr>
           <w:i w:val="0"/>
         </w:rPr>
-        <w:t>That argument is the standard one, and it contains a flaw specific to the asset class. Offshore jacket structures are built with four-fold symmetry about their vertical axis, not by coincidence but because a symmetric truss distributes environmental loading from any heading equally. The four faces are, to engineering tolerance, geometrically interchangeable, and we confirm this independently from sonar and from the CAD model. A place-recognition system, whether it matches appearance through a visual vocabulary or geometry through point-cloud registration, is therefore being asked to tell apart views that the structure's designer deliberately made identical. Perceptual aliasing of this kind is well known in general terms [8], [9]. What is specific here is that it can be predicted from the engineering drawing before the vehicle enters the water, and that it has a precise geometric signature: a wrong-face match is the correct estimate rotated about the structure's vertical axis by a multiple of ninety degrees, with its distance from the axis unchanged.</w:t>
+        <w:t>That argument is the standard one, and it contains a flaw specific to the asset class. Jacket foundations are lattices of tubular steel with three, four or more legs, and four-legged designs with a repeating bracing pattern are common; the primary steel of such a structure is close to four-fold symmetric about its vertical axis. Appurtenances such as boat landings, cable tubes, ladders and anodes break that symmetry to a degree that varies between structures, and how much they matter is an open question that we do not resolve here. In the idealised case the four faces are, to engineering tolerance, geometrically interchangeable, which we confirm from the CAD model and from sonar. A place-recognition system, whether it matches appearance through a visual vocabulary or geometry through point-cloud registration, is therefore being asked to tell apart views that the structure's designer deliberately made identical. Perceptual aliasing of this kind is well known in general terms [8], [23]. What is specific here is that it can be predicted from the engineering drawing before the vehicle enters the water, and that it has a precise geometric signature: a wrong-face match is the correct estimate rotated about the structure's vertical axis by a multiple of ninety degrees, with its distance from the axis unchanged.</w:t>
       </w:r>
     </w:p>
     <w:p>
@@ -106,7 +106,7 @@
         <w:rPr>
           <w:i w:val="0"/>
         </w:rPr>
-        <w:t>We tested whether that signature occurs. We recorded every loop closure that an off-the-shelf stereo SLAM front end made in eleven simulated inspection missions and classified each by the correction it imposed. Of twelve closures, six were small drift corrections of under two metres and a few degrees. Five were wrong-face closures: each rotated the estimate about the structure's axis by 90 degrees (once by 180) to within 2.5 degrees, preserved its radius to within three per cent, and moved it by 24 to 33 m. The ground-truth trajectory confirms this reading. At every wrong-face closure the vehicle's true position was at least 18 m from anywhere it had been, while the corrected estimate was placed within 0.3 m of somewhere it had; at every small correction the vehicle was back somewhere it had been. The closure logs show at least five of 28 missions affected, and in the best-characterised case a single closure took the position error from 0.3 m to tens of metres and fragmented the map, which did not recover.</w:t>
+        <w:t>We tested whether that signature occurs. We recorded every loop closure that an off-the-shelf stereo SLAM front end made in eleven simulated inspection missions and classified each by the correction it imposed. Of twelve closures, six were small drift corrections of under two metres and a few degrees. Five were wrong-face closures: each rotated the estimate about the structure's axis by 90 degrees (once by 180) to within 2.5 degrees, preserved its radius to within three per cent, and moved it by 24 to 33 m. The ground-truth trajectory confirms this reading. At every wrong-face closure the vehicle's true position was at least 18 m from anywhere it had been, while the corrected estimate was placed within 0.3 m of somewhere it had; at every small correction the vehicle was back somewhere it had been. The closure logs show at least five of 28 missions affected. In all five affected missions the aligned SLAM position was wrong by a median of 13 to 33 m in the two minutes after the closure, against a fit of 0.3 to 0.7 m before it, and the map re-initialised at least once afterwards.</w:t>
       </w:r>
     </w:p>
     <w:p>
@@ -117,7 +117,7 @@
         <w:rPr>
           <w:i w:val="0"/>
         </w:rPr>
-        <w:t>The consequence is less obvious than the failure. On the missions studied here, a single orbit of about 130 m, dead reckoning from the Doppler velocity log alone holds horizontal error to roughly 0.2 m RMS, even with a datasheet error model on the log and a gyro that drifts at three degrees per hour. A heading error displaces an estimate in proportion to its distance from where heading was last known, and an orbit never takes the vehicle far from where it began. Fusing the SLAM pose into the filter made the estimate worse, not better. The case for visual SLAM on a mission of this length therefore cannot rest on accuracy. It rests on missions long enough, or vehicles poorly enough instrumented, that dead reckoning stops being sufficient, and on the assumption that SLAM does no harm in the meantime. This paper examines that assumption.</w:t>
+        <w:t>The consequence is less obvious than the failure. On the missions studied here, a single orbit of about 130 m, dead reckoning from the Doppler velocity log alone holds horizontal error to roughly 0.2 m RMS, even with a datasheet error model on the log and a gyro that drifts at three degrees per hour. A heading error displaces an estimate in proportion to its distance from where heading was last known, and an orbit never takes the vehicle far from where it began. Fusing the SLAM pose into the filter made the estimate worse, not better, and with it the sonar model of the structure that the vehicle exists to produce: dead reckoning reconstructs it to about 0.1 m against the CAD model, and the corrected fused filter to 0.4 and 1.8 m in the two recordings made with it. The case for visual SLAM on a mission of this length therefore cannot rest on accuracy. It rests on missions long enough, or vehicles poorly enough instrumented, that dead reckoning stops being sufficient, and on the assumption that SLAM does no harm in the meantime. This paper examines that assumption.</w:t>
       </w:r>
     </w:p>
     <w:p>
@@ -139,7 +139,7 @@
         <w:rPr>
           <w:i w:val="0"/>
         </w:rPr>
-        <w:t>This leads to the position this paper takes. A known symmetry should be characterised before it is suffered. An inspection vehicle, unlike a general-purpose SLAM platform, always knows what it is inspecting; a CAD model of the asset exists before the mission is planned, and generic SLAM discards that prior. We quantify the symmetry of the target as an a-priori index computed from the model, and we argue that a correction whose geometry corresponds to a symmetry operation of the structure should be arbitrated by a modality that is blind to appearance: dead reckoning and depth, which cannot be fooled by a face that looks like another face. We establish the premise of that argument, that the hazard is real, frequent and identifiable from the correction alone. We do not evaluate the arbitration itself, and we do not show that the hazard falls as the structure is made less symmetric; that test is pre-registered, and Section 7 explains why it is not reported here.</w:t>
+        <w:t>This leads to the position this paper takes. A known symmetry should be characterised before it is suffered. An inspection vehicle, unlike a general-purpose SLAM platform, always knows what it is inspecting; a CAD model of the asset exists before the mission is planned, and generic SLAM discards that prior. Rejecting false loop closures is itself an established problem, addressed by robust back-ends [33], [34] and by consistency checks among closures [35]; what we ask is whether a known symmetry of the target offers a sharper test. We quantify the symmetry of the target as an a-priori index computed from the model, and we argue that a correction whose geometry corresponds to a symmetry operation of the structure should be arbitrated by a modality that is blind to appearance: dead reckoning and depth, which cannot be fooled by a face that looks like another face. We establish the premise of that argument, that the hazard is real, frequent and identifiable from the correction alone. We do not evaluate the arbitration itself, and we do not show that the hazard falls as the structure is made less symmetric; that test is pre-registered, and Section 7 explains why it is not reported here.</w:t>
       </w:r>
     </w:p>
     <w:p>
@@ -183,6 +183,14 @@
       </w:pPr>
       <w:r>
         <w:t>An event-level characterisation of loop closure on a four-fold symmetric structure: a classification rule fixed in advance, twelve closures from eleven missions, five of them wrong-face rotations of the estimate about the structure's axis, each confirmed against the ground-truth trajectory.</w:t>
+      </w:r>
+    </w:p>
+    <w:p>
+      <w:pPr>
+        <w:pStyle w:val="ListBullet"/>
+      </w:pPr>
+      <w:r>
+        <w:t>An inspection-product evaluation: the structure reconstructed from the vehicle's own sonar under each navigation source and scored against its CAD model. Dead reckoning reconstructs it to a median of 11 cm RMS against a sensor floor of 7 cm; a vehicle trusting SLAM through a wrong-face closure reconstructs it to 3.8 to 7.5 m.</w:t>
       </w:r>
     </w:p>
     <w:p>
@@ -330,7 +338,7 @@
         <w:rPr>
           <w:i w:val="0"/>
         </w:rPr>
-        <w:t>Transplanting these systems below the waterline is not routine, and the reasons are physical rather than algorithmic. Wavelength-dependent attenuation removes the red channel within metres and compresses contrast; suspended particulate backscatters artificial illumination into a veiling glow; and the scene itself — a painted steel member, a sandy seabed, a uniform field of marine growth — frequently lacks the corner structure that ORB and similar detectors require. Köser and Frese [17] give a thorough account of these challenges, and Hidalgo and Bräunl [18] survey the underwater SLAM literature. Image enhancement is commonly applied as a pre-processing stage, with colour-balance-and-fusion methods [19] and learned enhancement trained on benchmark datasets [20] both in use; enhancement improves feature yield but does not create structure where the scene has none.</w:t>
+        <w:t>Transplanting these systems below the waterline is not routine, and the reasons are physical rather than algorithmic. Wavelength-dependent attenuation removes the red channel within metres and compresses contrast; suspended particulate backscatters artificial illumination into a veiling glow; and the scene itself — a painted steel member, a sandy seabed, a uniform field of marine growth — frequently lacks the corner structure that ORB and similar detectors require. Köser and Frese [17] give a thorough account of these challenges, and Heshmat et al. [18] survey deep-learning-enhanced underwater SLAM. Image enhancement is commonly applied as a pre-processing stage, with colour-balance-and-fusion methods [19] and learned enhancement trained on benchmark datasets [20] both in use; enhancement improves feature yield but does not create structure where the scene has none.</w:t>
       </w:r>
     </w:p>
     <w:p>
@@ -555,12 +563,12 @@
     </w:p>
     <w:p>
       <w:r>
-        <w:t>[17] K. Köser and U. Frese, “Challenges in underwater visual navigation and SLAM,” in AI Technology for Underwater Robots, Springer, 2020.</w:t>
+        <w:t>[17] K. Köser and U. Frese, “Challenges in underwater visual navigation and SLAM,” in AI Technology for Underwater Robots, Springer, 2020, pp. 125–135.</w:t>
       </w:r>
     </w:p>
     <w:p>
       <w:r>
-        <w:t>[18] F. Hidalgo and T. Bräunl, “Review of underwater SLAM techniques,” Int. Conf. Automation, Robotics and Applications (ICARA), 2015.</w:t>
+        <w:t>[18] M. Heshmat, L. Saad Saoud, M. Abujabal, A. Sultan, M. Elmezain, L. Seneviratne and I. Hussain, “Underwater SLAM meets deep learning: challenges, multi-sensor integration, and future directions,” Sensors, vol. 25, no. 11, art. 3258, 2025.</w:t>
       </w:r>
     </w:p>
     <w:p>
@@ -575,12 +583,12 @@
     </w:p>
     <w:p>
       <w:r>
-        <w:t>[21] S. Rahman, A. Quattrini Li and I. Rekleitis, “SVIn2: a multi-sensor fusion-based underwater SLAM system,” Int. J. Robotics Research, 2022 (see also IROS 2019).</w:t>
+        <w:t>[21] S. Rahman, A. Quattrini Li and I. Rekleitis, “SVIn2: a multi-sensor fusion-based underwater SLAM system,” Int. J. Robotics Research, vol. 41, no. 11–12, pp. 1022–1042, 2022.</w:t>
       </w:r>
     </w:p>
     <w:p>
       <w:r>
-        <w:t>[22] M. Ferrera, V. Creuze, J. Moras and P. Trouvé-Peloux, “AQUALOC: an underwater dataset for visual–inertial–pressure localization,” Int. J. Robotics Research, vol. 38, no. 14, 2019.</w:t>
+        <w:t>[22] M. Ferrera, V. Creuze, J. Moras and P. Trouvé-Peloux, “AQUALOC: an underwater dataset for visual–inertial–pressure localization,” Int. J. Robotics Research, vol. 38, no. 14, pp. 1549–1559, 2019.</w:t>
       </w:r>
     </w:p>
     <w:p>
@@ -615,7 +623,7 @@
     </w:p>
     <w:p>
       <w:r>
-        <w:t>[29] F. Bonsignorio and A. P. del Pobil, “Toward replicable and measurable robotics research,” IEEE Robotics and Automation Magazine, vol. 22, no. 3, 2015.</w:t>
+        <w:t>[29] F. Bonsignorio and A. P. del Pobil, “Toward replicable and measurable robotics research,” IEEE Robotics and Automation Magazine, vol. 22, no. 3, pp. 32–35, 2015.</w:t>
       </w:r>
     </w:p>
     <w:p>
@@ -631,6 +639,21 @@
     <w:p>
       <w:r>
         <w:t>[32] P. Cieślak, “Stonefish: an advanced open-source simulation tool designed for marine robotics, with a ROS interface,” OCEANS Marseille, 2019.</w:t>
+      </w:r>
+    </w:p>
+    <w:p>
+      <w:r>
+        <w:t>[33] N. Sünderhauf and P. Protzel, “Switchable constraints for robust pose graph SLAM,” IROS, pp. 1879–1884, 2012.</w:t>
+      </w:r>
+    </w:p>
+    <w:p>
+      <w:r>
+        <w:t>[34] E. Olson and P. Agarwal, “Inference on networks of mixtures for robust robot mapping,” Int. J. Robotics Research, vol. 32, no. 7, 2013 (first presented at RSS 2012).</w:t>
+      </w:r>
+    </w:p>
+    <w:p>
+      <w:r>
+        <w:t>[35] J. G. Mangelson, D. Dominic, R. M. Eustice and R. Vasudevan, “Pairwise consistent measurement set maximization for robust multi-robot map merging,” ICRA, pp. 2916–2923, 2018.</w:t>
       </w:r>
     </w:p>
     <w:p>
@@ -717,6 +740,41 @@
         <w:rPr>
           <w:i/>
         </w:rPr>
+        <w:t>Checked on 2026-10-17 by web search (details: docs/paper/CITATION_CHECK.md):</w:t>
+      </w:r>
+    </w:p>
+    <w:p>
+      <w:pPr>
+        <w:pStyle w:val="ListBullet"/>
+      </w:pPr>
+      <w:r>
+        <w:t>Of the 29 real references, 25 were confirmed on authors, venue, year and pages; three exist but a detail is unconfirmed or differs between sources ([15] volume and pages, [16] page range, [29] confirmed by one source); one, [18], could not be found and has been replaced by a verified survey. Three references ([1], [2], [5]) remain placeholders. Only the titles and abstracts were checked: whether each paper supports the sentence it is cited for was checked for [8], [9] and [23] only. [9] is about data association and is used correctly for joint-compatibility checking, but it is not a source for perceptual aliasing, so the aliasing sentence now cites [8] and [23].</w:t>
+      </w:r>
+    </w:p>
+    <w:p>
+      <w:pPr>
+        <w:pStyle w:val="ListBullet"/>
+      </w:pPr>
+      <w:r>
+        <w:t>The premise that jackets are four-fold symmetric by engineering design is NOT supported. Sources found describe jackets with three, four or more legs and with boat landings and cable tubes that break symmetry; none says symmetry is a design aim. The Introduction was rewritten to say 'close to four-fold symmetric in the primary steel, symmetry broken by appurtenances, effect not resolved here'. The jacket description still needs an academic source; only project pages and patents were found.</w:t>
+      </w:r>
+    </w:p>
+    <w:p>
+      <w:pPr>
+        <w:pStyle w:val="ListBullet"/>
+      </w:pPr>
+      <w:r>
+        <w:t>Prior art on rejecting false loop closures is substantial and is now acknowledged: switchable constraints [33], max-mixtures [34], pairwise consistency [35], and others listed in CITATION_CHECK.md. The novelty claim is narrowed accordingly.</w:t>
+      </w:r>
+    </w:p>
+    <w:p>
+      <w:pPr>
+        <w:spacing w:after="160"/>
+      </w:pPr>
+      <w:r>
+        <w:rPr>
+          <w:i/>
+        </w:rPr>
         <w:t>Open, and NOT safe to assume in the prose:</w:t>
       </w:r>
     </w:p>
@@ -765,7 +823,15 @@
         <w:pStyle w:val="ListBullet"/>
       </w:pPr>
       <w:r>
-        <w:t>The shared landing bearing of the five wrong-face closures (+85 to +89 degrees). Five events, found after looking, not tested prospectively.</w:t>
+        <w:t>The shared landing bearing of the five wrong-face closures (+85 to +89 degrees). Two independent starting faces, not five, so weak evidence; not tested prospectively.</w:t>
+      </w:r>
+    </w:p>
+    <w:p>
+      <w:pPr>
+        <w:pStyle w:val="ListBullet"/>
+      </w:pPr>
+      <w:r>
+        <w:t>Whether a wrong-face closure causes the map re-initialisations that follow it. They follow it in all five missions but also occur in missions whose only closure was benign.</w:t>
       </w:r>
     </w:p>
     <w:p>

</xml_diff>